<commit_message>
render: _site y salidas intermedias regeneradas (render global del 2026-09-22)
Salida del render completo de 2026-09-22 que quedó sin confirmar: _site/
(páginas, PDF, DOCX, search.json, sitemap), index.html.md e index.tex
versionados de cada post (fecha ISO y campo curso del frontmatter), y
retirada de _site/SECURITY.html y de bibliotecas que el sitio ya no usa.
Confirmado antes de la campaña DOC10 (árbol limpio).

Co-Authored-By: Claude Opus 5.5 <noreply@anthropic.com>
</commit_message>
<xml_diff>
--- a/_site/posts/2025-05-11-teoria-y-politica-monetaria-bcrp/index.docx
+++ b/_site/posts/2025-05-11-teoria-y-politica-monetaria-bcrp/index.docx
@@ -194,7 +194,7 @@
         <w:t xml:space="preserve">Palabras clave</w:t>
       </w:r>
       <w:r>
-        <w:t xml:space="preserve">: keyword1, keyword2</w:t>
+        <w:t xml:space="preserve">:</w:t>
       </w:r>
     </w:p>
     <w:p>
@@ -2438,6 +2438,33 @@
         <w:t xml:space="preserve">lo que mehos hecho es caracterizar el recurso disponible</w:t>
       </w:r>
     </w:p>
+    <w:p>
+      <w:r>
+        <w:pict>
+          <v:rect style="width:0;height:1.5pt" o:hralign="center" o:hrstd="t" o:hr="t"/>
+        </w:pict>
+      </w:r>
+    </w:p>
+    <w:p>
+      <w:pPr>
+        <w:pStyle w:val="FirstParagraph"/>
+      </w:pPr>
+      <w:r>
+        <w:t xml:space="preserve">tipo: fragmento</w:t>
+      </w:r>
+      <w:r>
+        <w:t xml:space="preserve"> </w:t>
+      </w:r>
+      <w:r>
+        <w:t xml:space="preserve">titulo: texto de apertura del bloque «Publicaciones similares» (incluido en cada post)</w:t>
+      </w:r>
+      <w:r>
+        <w:t xml:space="preserve"> </w:t>
+      </w:r>
+      <w:r>
+        <w:t xml:space="preserve">—</w:t>
+      </w:r>
+    </w:p>
     <w:bookmarkEnd w:id="27"/>
     <w:bookmarkStart w:id="54" w:name="publicaciones-similares"/>
     <w:p>
@@ -2730,8 +2757,35 @@
       </w:hyperlink>
     </w:p>
     <w:p>
+      <w:r>
+        <w:pict>
+          <v:rect style="width:0;height:1.5pt" o:hralign="center" o:hrstd="t" o:hr="t"/>
+        </w:pict>
+      </w:r>
+    </w:p>
+    <w:p>
       <w:pPr>
         <w:pStyle w:val="FirstParagraph"/>
+      </w:pPr>
+      <w:r>
+        <w:t xml:space="preserve">tipo: fragmento</w:t>
+      </w:r>
+      <w:r>
+        <w:t xml:space="preserve"> </w:t>
+      </w:r>
+      <w:r>
+        <w:t xml:space="preserve">titulo: texto de cierre del bloque «Publicaciones similares» (incluido en cada post)</w:t>
+      </w:r>
+      <w:r>
+        <w:t xml:space="preserve"> </w:t>
+      </w:r>
+      <w:r>
+        <w:t xml:space="preserve">—</w:t>
+      </w:r>
+    </w:p>
+    <w:p>
+      <w:pPr>
+        <w:pStyle w:val="BodyText"/>
       </w:pPr>
       <w:r>
         <w:t xml:space="preserve">Esperamos que encuentres estas publicaciones igualmente interesantes y útiles. ¡Disfruta de la lectura!</w:t>

</xml_diff>

<commit_message>
build(site): render reproducible con LuaLaTeX (render.sh; ola 6, 6d)
Co-Authored-By: Claude Opus 5.5 <noreply@anthropic.com>
</commit_message>
<xml_diff>
--- a/_site/posts/2025-05-11-teoria-y-politica-monetaria-bcrp/index.docx
+++ b/_site/posts/2025-05-11-teoria-y-politica-monetaria-bcrp/index.docx
@@ -2438,33 +2438,6 @@
         <w:t xml:space="preserve">lo que mehos hecho es caracterizar el recurso disponible</w:t>
       </w:r>
     </w:p>
-    <w:p>
-      <w:r>
-        <w:pict>
-          <v:rect style="width:0;height:1.5pt" o:hralign="center" o:hrstd="t" o:hr="t"/>
-        </w:pict>
-      </w:r>
-    </w:p>
-    <w:p>
-      <w:pPr>
-        <w:pStyle w:val="FirstParagraph"/>
-      </w:pPr>
-      <w:r>
-        <w:t xml:space="preserve">tipo: fragmento</w:t>
-      </w:r>
-      <w:r>
-        <w:t xml:space="preserve"> </w:t>
-      </w:r>
-      <w:r>
-        <w:t xml:space="preserve">titulo: texto de apertura del bloque «Publicaciones similares» (incluido en cada post)</w:t>
-      </w:r>
-      <w:r>
-        <w:t xml:space="preserve"> </w:t>
-      </w:r>
-      <w:r>
-        <w:t xml:space="preserve">—</w:t>
-      </w:r>
-    </w:p>
     <w:bookmarkEnd w:id="27"/>
     <w:bookmarkStart w:id="54" w:name="publicaciones-similares"/>
     <w:p>
@@ -2757,35 +2730,8 @@
       </w:hyperlink>
     </w:p>
     <w:p>
-      <w:r>
-        <w:pict>
-          <v:rect style="width:0;height:1.5pt" o:hralign="center" o:hrstd="t" o:hr="t"/>
-        </w:pict>
-      </w:r>
-    </w:p>
-    <w:p>
       <w:pPr>
         <w:pStyle w:val="FirstParagraph"/>
-      </w:pPr>
-      <w:r>
-        <w:t xml:space="preserve">tipo: fragmento</w:t>
-      </w:r>
-      <w:r>
-        <w:t xml:space="preserve"> </w:t>
-      </w:r>
-      <w:r>
-        <w:t xml:space="preserve">titulo: texto de cierre del bloque «Publicaciones similares» (incluido en cada post)</w:t>
-      </w:r>
-      <w:r>
-        <w:t xml:space="preserve"> </w:t>
-      </w:r>
-      <w:r>
-        <w:t xml:space="preserve">—</w:t>
-      </w:r>
-    </w:p>
-    <w:p>
-      <w:pPr>
-        <w:pStyle w:val="BodyText"/>
       </w:pPr>
       <w:r>
         <w:t xml:space="preserve">Esperamos que encuentres estas publicaciones igualmente interesantes y útiles. ¡Disfruta de la lectura!</w:t>

</xml_diff>